<commit_message>
B2 cover letter: rebuild docx + PDF from current .md (mirror of workflow clone)
Co-Authored-By: Claude Opus 4.8 (1M context) <noreply@anthropic.com>
</commit_message>
<xml_diff>
--- a/b2/paper/responses/2026-05-26_R2_cover_letter.docx
+++ b/b2/paper/responses/2026-05-26_R2_cover_letter.docx
@@ -58,7 +58,7 @@
         <w:t xml:space="preserve"> </w:t>
       </w:r>
       <w:r>
-        <w:t xml:space="preserve">Governance Concentration Beyond Token Allocation: A 40-Protocol Cross-Sectional Audit of DePIN and DeFi After Protocol-Controlled-Address Exclusion (Manuscript ID 1853465; SSRN 6599278)</w:t>
+        <w:t xml:space="preserve">Governance Concentration Beyond Token Allocation: A 52-Protocol Cross-Sectional Audit of DePIN and DeFi After Protocol-Controlled-Address Exclusion (Manuscript ID 1853465; SSRN 6599278)</w:t>
       </w:r>
       <w:r>
         <w:t xml:space="preserve"> </w:t>
@@ -111,7 +111,7 @@
         <w:t xml:space="preserve">) to empirical-audit framing (</w:t>
       </w:r>
       <w:r>
-        <w:t xml:space="preserve">“A 40-Protocol Cross-Sectional Audit … After Protocol-Controlled-Address Exclusion”</w:t>
+        <w:t xml:space="preserve">“A 52-Protocol Cross-Sectional Audit … After Protocol-Controlled-Address Exclusion”</w:t>
       </w:r>
       <w:r>
         <w:t xml:space="preserve">). The R1 lead-phrase preservation is deliberate: it provides editorial-system continuity (the working title matches the R1 lead phrase exactly), while the new subtitle signals the R2 reframing toward the empirical-measurement contribution. The institutional-design-and-philosophical-interpretation thread has been moved to a companion paper (Zukowski, 2026e), allowing the R2 title and abstract to lead directly with the audit contribution.</w:t>
@@ -175,7 +175,7 @@
         <w:t xml:space="preserve"> </w:t>
       </w:r>
       <w:r>
-        <w:t xml:space="preserve">“Governance Concentration Beyond Token Allocation: A 40-Protocol Cross-Sectional Audit of DePIN and DeFi After Protocol-Controlled-Address Exclusion”</w:t>
+        <w:t xml:space="preserve">“Governance Concentration Beyond Token Allocation: A 52-Protocol Cross-Sectional Audit of DePIN and DeFi After Protocol-Controlled-Address Exclusion”</w:t>
       </w:r>
       <w:r>
         <w:t xml:space="preserve"> </w:t>
@@ -301,13 +301,13 @@
           <w:b/>
           <w:bCs/>
         </w:rPr>
-        <w:t xml:space="preserve">Predominant delegation amplification with four structural exceptions</w:t>
-      </w:r>
-      <w:r>
-        <w:t xml:space="preserve"> </w:t>
-      </w:r>
-      <w:r>
-        <w:t xml:space="preserve">(Section 4.5) - Voting-HHI exceeds post-exclusion holding HHI in nine of thirteen protocols with sufficient governance data (range 1.6x DRIFT to 9.9x Compound; mean approximately 4.9x). Four protocols disperse voting power below the holding baseline (ENS at 0.45x; GMX at 0.87x; HNT at 0.35x to 0.53x; JUP at 0.057x, the most-extreme dispersion outlier in the cross-section). Curve veCRV and Balancer veBAL form a separate vote-escrowed class with extreme amplification (15x and 21x respectively).</w:t>
+        <w:t xml:space="preserve">Predominant delegation amplification with five structural exceptions</w:t>
+      </w:r>
+      <w:r>
+        <w:t xml:space="preserve"> </w:t>
+      </w:r>
+      <w:r>
+        <w:t xml:space="preserve">(Section 4.5) - Voting-HHI exceeds post-exclusion holding HHI in thirteen of eighteen protocols with sufficient governance data (range 1.6x DRIFT to 25.6x Polkadot; mean approximately 6.8x, median 4.4x). Five protocols disperse voting power below the holding baseline (ENS at 0.45x; GMX at 0.87x; HNT at 0.35x to 0.53x; JUP at 0.057x, the most-extreme dispersion outlier in the cross-section; and LPT at 0.27x, the most pronounced DePIN governance disperser, with Livepeer holding concentration unchanged at the cross-section maximum). Curve veCRV, Balancer veBAL, and Frax veFXS form a separate vote-escrowed class with extreme amplification (15x, 21x, and 11.4x respectively).</w:t>
       </w:r>
     </w:p>
     <w:bookmarkEnd w:id="9"/>
@@ -402,7 +402,7 @@
         <w:t xml:space="preserve">Supplementary files</w:t>
       </w:r>
       <w:r>
-        <w:t xml:space="preserve">: S0 (canonical statistics ledger; new); S1 (metric definitions); S2-S3 (codebook plus optional governance-scoring instruments retained as supplementary, not load-bearing for the empirical analysis); S4 (events table); S5 (empirical pipeline specification including per-iteration LOO data and per-protocol participation values); S6 (source provenance, revenue standardization, address-by-address PCA exclusion documentation); S7 (quarterly HHI panel for 14 governance tokens across 8 quarters); S8 (Token Terminal subsidy expansion analysis with sector-control multivariate models); S9 (Theil and Atkinson concentration metrics robustness check); S10 (PCA classification robustness across Specs A through E); S11 (Shapley-Shubik and Banzhaf power-index calculations); S12 (PCA-symmetric voting-HHI and signer-side functional PCA cases); S15 (Optimism worked example); S16 (Aethir, IoTeX, and ENS sensitivity analyses); S17 (falsifiable predictions and pre-registration specification)</w:t>
+        <w:t xml:space="preserve">: S0 (canonical statistics ledger); S1 (metric definitions); S2-S3 (codebook plus optional governance-scoring instruments retained as supplementary, not load-bearing for the empirical analysis); S4 (events table); S5 (empirical pipeline specification including per-iteration LOO data and per-protocol participation values); S6 (source provenance and revenue standardization); S7 (quarterly HHI panel for 14 governance tokens across 8 quarters); S8 (Token Terminal subsidy expansion analysis with sector-control multivariate models); S9 (Theil and Atkinson concentration-metric robustness check); S10 (PCA classification robustness across Specs A through E); S11 (Shapley-Shubik and Banzhaf power-index calculations); S12 (PCA-symmetric voting-HHI and signer-side functional PCA cases); S13 (Solana PCA exclusion audit including cross-protocol candidate-address verification); S14 (Shapley-Shubik and Banzhaf power-index full closure across the N=16 cross-source voting sample); S15 (voting-HHI Phase 3 expansion across the N=52 cross-section); S16a (Aethir, IoTeX, and ENS sensitivity analyses); S16b (sample-expansion batch: FXS, SNX, GNO, TAO); S16c (Polkadot fifth-protocol closure); S17 (falsifiable predictions and pre-registration specification); S18 (EVM sample-expansion PCA classification with two-layer audit); S19 (Polkadot validator-set five-axis attribution methodology); S20 (Polkadot Subscan refresh finding); S21 (Class 3 versus Class 5 PCA disambiguation via transaction-pattern signatures); S22 (insider classification of record and staking-attribution audit); S23 (Q1-to-Q8 governance-HHI trajectory analysis on the 14-protocol panel); S24 (Optimism worked example)</w:t>
       </w:r>
     </w:p>
     <w:p>
@@ -410,7 +410,7 @@
         <w:pStyle w:val="FirstParagraph"/>
       </w:pPr>
       <w:r>
-        <w:t xml:space="preserve">S13 and S14 are not in the R2 package: the prior placeholders for reserved or externally hosted replication artifacts did not point to concrete content, and have been removed from the supplement list to avoid orphan references. Replication code and the full canonical regression dataset continue to be available at the linked GitHub repository.</w:t>
+        <w:t xml:space="preserve">The address-by-address PCA exclusion log and the full canonical regression dataset are available at the linked GitHub replication repository.</w:t>
       </w:r>
     </w:p>
     <w:bookmarkEnd w:id="10"/>
@@ -514,13 +514,13 @@
         <w:t xml:space="preserve"> </w:t>
       </w:r>
       <w:r>
-        <w:t xml:space="preserve">“predominant amplification across nine of thirteen protocols with four structural exceptions documenting design-tractable dispersion.”</w:t>
-      </w:r>
-      <w:r>
-        <w:t xml:space="preserve"> </w:t>
-      </w:r>
-      <w:r>
-        <w:t xml:space="preserve">The R2 manuscript’s empirical contributions are stronger than the R1 manuscript’s because the reviewer’s audit framing was applied at saturation depth. We thank Reviewer 2 for the endorsement of publication.</w:t>
+        <w:t xml:space="preserve">“predominant amplification across thirteen of eighteen protocols with five structural exceptions documenting design-tractable dispersion.”</w:t>
+      </w:r>
+      <w:r>
+        <w:t xml:space="preserve"> </w:t>
+      </w:r>
+      <w:r>
+        <w:t xml:space="preserve">The manuscript’s empirical contributions are stronger than the R1 manuscript’s because the reviewer’s audit framing was applied at saturation depth. We thank Reviewer 2 for the endorsement of publication.</w:t>
       </w:r>
     </w:p>
     <w:p>

</xml_diff>

<commit_message>
B2 response package: reviewer-facing cleanup (mirror of workflow clone)
Strip internal-process exposure; package reads as one coherent R1->R2 revision. Stale
40-Protocol title/dataset fixed to 52. Numbers at canonical final values; 0 residual leaks.

Co-Authored-By: Claude Opus 4.8 (1M context) <noreply@anthropic.com>
</commit_message>
<xml_diff>
--- a/b2/paper/responses/2026-05-26_R2_cover_letter.docx
+++ b/b2/paper/responses/2026-05-26_R2_cover_letter.docx
@@ -114,7 +114,7 @@
         <w:t xml:space="preserve">“A 52-Protocol Cross-Sectional Audit … After Protocol-Controlled-Address Exclusion”</w:t>
       </w:r>
       <w:r>
-        <w:t xml:space="preserve">). The R1 lead-phrase preservation is deliberate: it provides editorial-system continuity (the working title matches the R1 lead phrase exactly), while the new subtitle signals the R2 reframing toward the empirical-measurement contribution. The institutional-design-and-philosophical-interpretation thread has been moved to a companion paper (Zukowski, 2026e), allowing the R2 title and abstract to lead directly with the audit contribution.</w:t>
+        <w:t xml:space="preserve">). The R1 lead-phrase preservation is deliberate: it provides editorial-system continuity (the working title matches the R1 lead phrase exactly), while the new subtitle signals the reframing toward the empirical-measurement contribution. The institutional-design-and-philosophical-interpretation thread has been moved to a companion paper (Zukowski, 2026e), allowing the title and abstract to lead directly with the audit contribution.</w:t>
       </w:r>
       <w:r>
         <w:t xml:space="preserve"> </w:t>
@@ -181,7 +181,7 @@
         <w:t xml:space="preserve"> </w:t>
       </w:r>
       <w:r>
-        <w:t xml:space="preserve">addressing Reviewer 1’s four Round 2 issues and incorporating substantial post-R1 strengthening across data, methodology, and manuscript architecture. Point-by-point responses to all four reviewer issues, plus a narrative of the post-R1 cycles that further refined the manuscript, are documented in the accompanying response document (</w:t>
+        <w:t xml:space="preserve">addressing Reviewer 1’s four Round 2 issues and incorporating substantial strengthening across data, methodology, and manuscript architecture. Point-by-point responses to all four reviewer issues are documented in the accompanying response document (</w:t>
       </w:r>
       <w:r>
         <w:rPr>
@@ -193,37 +193,29 @@
         <w:t xml:space="preserve">), which is structured for direct copy-paste into the Frontiers reviewer-response web form.</w:t>
       </w:r>
     </w:p>
+    <w:bookmarkStart w:id="9" w:name="manuscript-identity-change-since-r1"/>
+    <w:p>
+      <w:pPr>
+        <w:pStyle w:val="Heading2"/>
+      </w:pPr>
+      <w:r>
+        <w:t xml:space="preserve">Manuscript identity change since R1</w:t>
+      </w:r>
+    </w:p>
+    <w:p>
+      <w:pPr>
+        <w:pStyle w:val="FirstParagraph"/>
+      </w:pPr>
+      <w:r>
+        <w:t xml:space="preserve">The manuscript has been reframed around its empirical-measurement contribution. The R1 manuscript developed a five-lens philosophical framework integrated with empirical results; the revised manuscript leads with the measurement contributions and routes the philosophical-interpretation thread to a companion paper. This reframing preserves every R1 statistical finding. What is different is the architecture: empirical contributions are now the spine, with normative interpretation moved to a companion paper that develops the Polanyian fourth-fictitious-commodity argument at the depth that thesis warrants.</w:t>
+      </w:r>
+    </w:p>
     <w:p>
       <w:pPr>
         <w:pStyle w:val="BodyText"/>
       </w:pPr>
       <w:r>
-        <w:t xml:space="preserve">This R2 submission supersedes the 2026-05-17 R2 draft prepared after the initial R1 response cycle. The 2026-05-17 draft is preserved as an audit-trail artifact; the present 2026-05-26 submission reflects the post-2026-05-17 strengthening cycles (deep PCA audit; voting-HHI methodology refresh; multi-source PCA-symmetric extension; raw-OC subsidy refinement; historical burn empirical refresh) plus an empirical-paper reframe completed during a final polish cycle.</w:t>
-      </w:r>
-    </w:p>
-    <w:bookmarkStart w:id="9" w:name="manuscript-identity-change-since-r1"/>
-    <w:p>
-      <w:pPr>
-        <w:pStyle w:val="Heading2"/>
-      </w:pPr>
-      <w:r>
-        <w:t xml:space="preserve">Manuscript identity change since R1</w:t>
-      </w:r>
-    </w:p>
-    <w:p>
-      <w:pPr>
-        <w:pStyle w:val="FirstParagraph"/>
-      </w:pPr>
-      <w:r>
-        <w:t xml:space="preserve">The manuscript has been reframed around its empirical-measurement contribution. The R1 manuscript developed a five-lens philosophical-framework integrated with empirical results; the R2 manuscript leads with the measurement contributions and routes the philosophical-interpretation thread to a companion paper. This reframing preserves every R1 statistical finding. What is different is the architecture: empirical contributions are now the spine, with normative interpretation moved to a companion paper that develops the Polanyian fourth-fictitious-commodity argument at the depth that thesis warrants.</w:t>
-      </w:r>
-    </w:p>
-    <w:p>
-      <w:pPr>
-        <w:pStyle w:val="BodyText"/>
-      </w:pPr>
-      <w:r>
-        <w:t xml:space="preserve">The R2 manuscript reports four empirical contributions (Section 5.6):</w:t>
+        <w:t xml:space="preserve">The revised manuscript reports four empirical contributions (Section 5.6):</w:t>
       </w:r>
     </w:p>
     <w:p>
@@ -333,13 +325,13 @@
           <w:b/>
           <w:bCs/>
         </w:rPr>
-        <w:t xml:space="preserve">B2_Post_Polish_Cycle_2026-05-26_clean.docx</w:t>
-      </w:r>
-      <w:r>
-        <w:t xml:space="preserve"> </w:t>
-      </w:r>
-      <w:r>
-        <w:t xml:space="preserve">- Revised manuscript (clean version; DOCX-only build target with pre-publication conversion handled by Frontiers production pipeline)</w:t>
+        <w:t xml:space="preserve">Revised manuscript (clean version)</w:t>
+      </w:r>
+      <w:r>
+        <w:t xml:space="preserve"> </w:t>
+      </w:r>
+      <w:r>
+        <w:t xml:space="preserve">- the full R2 manuscript incorporating all changes described in the response document</w:t>
       </w:r>
     </w:p>
     <w:p>
@@ -361,7 +353,7 @@
         <w:t xml:space="preserve"> </w:t>
       </w:r>
       <w:r>
-        <w:t xml:space="preserve">- Point-by-point response to Reviewer 1’s R2 issues plus the post-R1 strengthening narrative (markdown source for direct copy-paste into the Frontiers reviewer-response web form)</w:t>
+        <w:t xml:space="preserve">- Point-by-point response to Reviewer 1’s R2 issues (markdown source for direct copy-paste into the Frontiers reviewer-response web form)</w:t>
       </w:r>
     </w:p>
     <w:p>
@@ -402,7 +394,7 @@
         <w:t xml:space="preserve">Supplementary files</w:t>
       </w:r>
       <w:r>
-        <w:t xml:space="preserve">: S0 (canonical statistics ledger); S1 (metric definitions); S2-S3 (codebook plus optional governance-scoring instruments retained as supplementary, not load-bearing for the empirical analysis); S4 (events table); S5 (empirical pipeline specification including per-iteration LOO data and per-protocol participation values); S6 (source provenance and revenue standardization); S7 (quarterly HHI panel for 14 governance tokens across 8 quarters); S8 (Token Terminal subsidy expansion analysis with sector-control multivariate models); S9 (Theil and Atkinson concentration-metric robustness check); S10 (PCA classification robustness across Specs A through E); S11 (Shapley-Shubik and Banzhaf power-index calculations); S12 (PCA-symmetric voting-HHI and signer-side functional PCA cases); S13 (Solana PCA exclusion audit including cross-protocol candidate-address verification); S14 (Shapley-Shubik and Banzhaf power-index full closure across the N=16 cross-source voting sample); S15 (voting-HHI Phase 3 expansion across the N=52 cross-section); S16a (Aethir, IoTeX, and ENS sensitivity analyses); S16b (sample-expansion batch: FXS, SNX, GNO, TAO); S16c (Polkadot fifth-protocol closure); S17 (falsifiable predictions and pre-registration specification); S18 (EVM sample-expansion PCA classification with two-layer audit); S19 (Polkadot validator-set five-axis attribution methodology); S20 (Polkadot Subscan refresh finding); S21 (Class 3 versus Class 5 PCA disambiguation via transaction-pattern signatures); S22 (insider classification of record and staking-attribution audit); S23 (Q1-to-Q8 governance-HHI trajectory analysis on the 14-protocol panel); S24 (Optimism worked example)</w:t>
+        <w:t xml:space="preserve">: S0 (statistics ledger); S1 (metric definitions); S2-S3 (codebook plus optional governance-scoring instruments retained as supplementary, not load-bearing for the empirical analysis); S4 (events table); S5 (empirical pipeline specification including per-iteration LOO data and per-protocol participation values); S6 (source provenance and revenue standardization); S7 (quarterly HHI panel for 14 governance tokens across 8 quarters); S8 (Token Terminal subsidy expansion analysis with sector-control multivariate models); S9 (Theil and Atkinson concentration-metric robustness check); S10 (PCA classification robustness across Specs A through E); S11 (Shapley-Shubik and Banzhaf power-index calculations); S12 (PCA-symmetric voting-HHI and signer-side functional PCA cases); S13 (Solana PCA exclusion audit including cross-protocol candidate-address verification); S14 (Shapley-Shubik and Banzhaf power-index full closure across the N=16 cross-source voting sample); S15 (voting-HHI coverage across the N=52 cross-section); S16a (Aethir, IoTeX, and ENS sensitivity analyses); S16b (additional protocols: FXS, SNX, GNO, TAO); S16c (Polkadot governance analysis); S17 (falsifiable predictions and pre-registration specification); S18 (EVM PCA classification with two-layer audit); S19 (Polkadot validator-set five-axis attribution methodology); S20 (Polkadot Subscan delegate-pool analysis); S21 (Class 3 versus Class 5 PCA disambiguation via transaction-pattern signatures); S22 (insider classification and staking-attribution audit); S23 (Q1-to-Q8 governance-HHI trajectory analysis on the 14-protocol panel); S24 (Optimism worked example)</w:t>
       </w:r>
     </w:p>
     <w:p>
@@ -410,7 +402,7 @@
         <w:pStyle w:val="FirstParagraph"/>
       </w:pPr>
       <w:r>
-        <w:t xml:space="preserve">The address-by-address PCA exclusion log and the full canonical regression dataset are available at the linked GitHub replication repository.</w:t>
+        <w:t xml:space="preserve">The address-by-address PCA exclusion log and the full regression dataset are available at the linked GitHub replication repository.</w:t>
       </w:r>
     </w:p>
     <w:bookmarkEnd w:id="10"/>
@@ -428,39 +420,7 @@
         <w:pStyle w:val="FirstParagraph"/>
       </w:pPr>
       <w:r>
-        <w:t xml:space="preserve">The R2 cycle adopted a single-canonical-regression-dataset-of-record discipline to prevent recurrence of the manuscript-vs-data drift Reviewer 1 surfaced in the R1 review. A canonical statistics ledger (Supplementary File S0) lists every body-text statistic with its sample size and the reporting convention; the ledger is the single source of truth that body, tables, figures, captions, abstract, and conclusion reconcile against. Snapshot-date discipline is acknowledged: Table 7 voting-HHI values for the eight protocols sampled at the R1 scope use a March 2026 snapshot consistent with the rest of the dataset; the GMX and ENS additions from the post-R1 sample-expansion cycle use a May 2026 Tally snapshot (documented in Section 4.5 Table 7 footnote as a deliberate methodological exception for sample-expansion protocols). The May 2026 Tally and Snapshot replication confirms delegate-pool drift; rank ordering across protocols is the more durable inferential property than absolute magnitude.</w:t>
-      </w:r>
-    </w:p>
-    <w:p>
-      <w:pPr>
-        <w:pStyle w:val="BodyText"/>
-      </w:pPr>
-      <w:r>
-        <w:t xml:space="preserve">The S0 ledger plus submission-readiness validation tooling (</w:t>
-      </w:r>
-      <w:r>
-        <w:rPr>
-          <w:rStyle w:val="VerbatimChar"/>
-        </w:rPr>
-        <w:t xml:space="preserve">tools/content-build/submission_readiness_check.py</w:t>
-      </w:r>
-      <w:r>
-        <w:t xml:space="preserve"> </w:t>
-      </w:r>
-      <w:r>
-        <w:t xml:space="preserve">+</w:t>
-      </w:r>
-      <w:r>
-        <w:t xml:space="preserve"> </w:t>
-      </w:r>
-      <w:r>
-        <w:rPr>
-          <w:rStyle w:val="VerbatimChar"/>
-        </w:rPr>
-        <w:t xml:space="preserve">reviewer_trap_lint.py</w:t>
-      </w:r>
-      <w:r>
-        <w:t xml:space="preserve">) reduce the surface area where caption-versus-text drift can recur. These tools verify figure-path existence, supplement-reference resolution, output_formats template existence, current_version coherence in METADATA, build-warning-free invocation, figure-caption numbering coherence, and prose-side lint for causal-overclaim language and pandoc residue.</w:t>
+        <w:t xml:space="preserve">The revision reconciles all reported statistics against a single source-of-truth regression dataset to prevent recurrence of the manuscript-vs-data drift Reviewer 1 surfaced in the R1 review. A statistics ledger (Supplementary File S0) lists every body-text statistic with its sample size and the reporting convention; the ledger is the single source of truth that body, tables, figures, captions, abstract, and conclusion reconcile against, and all reported statistics are reconciled against it. Snapshot-date discipline is acknowledged: Table 7 voting-HHI values for the eight protocols sampled at the R1 scope use a March 2026 snapshot consistent with the rest of the dataset; the GMX and ENS additions use a May 2026 Tally snapshot (documented in Section 4.5 Table 7 footnote as a deliberate methodological exception for the added protocols). The May 2026 Tally and Snapshot replication confirms delegate-pool drift; rank ordering across protocols is the more durable inferential property than absolute magnitude.</w:t>
       </w:r>
     </w:p>
     <w:bookmarkEnd w:id="11"/>
@@ -496,7 +456,7 @@
         <w:pStyle w:val="FirstParagraph"/>
       </w:pPr>
       <w:r>
-        <w:t xml:space="preserve">We thank Reviewer 1 for the comprehensive cross-surface audit in R1 that surfaced the manuscript-vs-data drift class and motivated the R2 reproduce-and-sync discipline. The reproduce-and-sync framing in turn enabled the post-R1 strengthening cycles (deep PCA audit; voting-HHI methodology refresh; multi-source PCA-symmetric extension across Tally, Snapshot, and Solana on-chain governance program parsing) that produced the substantive R2 thesis evolution: the headline finding moved from</w:t>
+        <w:t xml:space="preserve">We thank Reviewer 1 for the comprehensive cross-surface audit in R1 that surfaced the manuscript-vs-data drift class and motivated the reproduce-and-sync discipline adopted in this revision. Responding to that audit directly produced the substantive thesis evolution in the revised manuscript: the headline finding moved from</w:t>
       </w:r>
       <w:r>
         <w:t xml:space="preserve"> </w:t>
@@ -520,7 +480,7 @@
         <w:t xml:space="preserve"> </w:t>
       </w:r>
       <w:r>
-        <w:t xml:space="preserve">The manuscript’s empirical contributions are stronger than the R1 manuscript’s because the reviewer’s audit framing was applied at saturation depth. We thank Reviewer 2 for the endorsement of publication.</w:t>
+        <w:t xml:space="preserve">The revised manuscript’s empirical contributions are stronger than the R1 manuscript’s because the reviewer’s audit framing was applied throughout the data, methodology, and architecture. We thank Reviewer 2 for the endorsement of publication.</w:t>
       </w:r>
     </w:p>
     <w:p>

</xml_diff>

<commit_message>
B2 cover letter: address handling editor Dr. Ingrid Vasiliu-Feltes by name (mirror)
Co-Authored-By: Claude Opus 4.8 (1M context) <noreply@anthropic.com>
</commit_message>
<xml_diff>
--- a/b2/paper/responses/2026-05-26_R2_cover_letter.docx
+++ b/b2/paper/responses/2026-05-26_R2_cover_letter.docx
@@ -26,7 +26,7 @@
         <w:t xml:space="preserve"> </w:t>
       </w:r>
       <w:r>
-        <w:t xml:space="preserve">Editorial Office, Frontiers in Blockchain</w:t>
+        <w:t xml:space="preserve">Dr. Ingrid Vasiliu-Feltes, Frontiers in Blockchain</w:t>
       </w:r>
       <w:r>
         <w:t xml:space="preserve"> </w:t>
@@ -161,7 +161,7 @@
         <w:pStyle w:val="FirstParagraph"/>
       </w:pPr>
       <w:r>
-        <w:t xml:space="preserve">Dear Editor and Reviewers,</w:t>
+        <w:t xml:space="preserve">Dear Dr. Vasiliu-Feltes and Reviewers,</w:t>
       </w:r>
     </w:p>
     <w:p>

</xml_diff>

<commit_message>
B2: spelled-out R2 title in cover letter and responses master (Protocol-Address-Corrected); docx and pdf rebuilt
</commit_message>
<xml_diff>
--- a/b2/paper/responses/2026-05-26_R2_cover_letter.docx
+++ b/b2/paper/responses/2026-05-26_R2_cover_letter.docx
@@ -58,7 +58,7 @@
         <w:t xml:space="preserve"> </w:t>
       </w:r>
       <w:r>
-        <w:t xml:space="preserve">Governance Concentration Beyond Token Allocation: A 52-Protocol Cross-Sectional Audit of DePIN and DeFi After Protocol-Controlled-Address Exclusion (Manuscript ID 1853465; SSRN 6599278)</w:t>
+        <w:t xml:space="preserve">Governance Concentration Beyond Token Allocation: A Protocol-Address-Corrected Cross-Sectional Audit of 52 DePIN and DeFi Protocols (Manuscript ID 1853465; SSRN 6599278)</w:t>
       </w:r>
       <w:r>
         <w:t xml:space="preserve"> </w:t>
@@ -111,7 +111,7 @@
         <w:t xml:space="preserve">) to empirical-audit framing (</w:t>
       </w:r>
       <w:r>
-        <w:t xml:space="preserve">“A 52-Protocol Cross-Sectional Audit … After Protocol-Controlled-Address Exclusion”</w:t>
+        <w:t xml:space="preserve">“A Protocol-Address-Corrected Cross-Sectional Audit of 52 DePIN and DeFi Protocols”</w:t>
       </w:r>
       <w:r>
         <w:t xml:space="preserve">). The R1 lead-phrase preservation is deliberate: it provides editorial-system continuity (the working title matches the R1 lead phrase exactly), while the new subtitle signals the reframing toward the empirical-measurement contribution. The institutional-design-and-philosophical-interpretation thread has been moved to a companion paper (Zukowski, 2026e), allowing the title and abstract to lead directly with the audit contribution.</w:t>
@@ -175,7 +175,7 @@
         <w:t xml:space="preserve"> </w:t>
       </w:r>
       <w:r>
-        <w:t xml:space="preserve">“Governance Concentration Beyond Token Allocation: A 52-Protocol Cross-Sectional Audit of DePIN and DeFi After Protocol-Controlled-Address Exclusion”</w:t>
+        <w:t xml:space="preserve">“Governance Concentration Beyond Token Allocation: A Protocol-Address-Corrected Cross-Sectional Audit of 52 DePIN and DeFi Protocols”</w:t>
       </w:r>
       <w:r>
         <w:t xml:space="preserve"> </w:t>

</xml_diff>

<commit_message>
B2 R2 response package: mirror author polish + rebuild docx/pdf (cover letter + responses master)
</commit_message>
<xml_diff>
--- a/b2/paper/responses/2026-05-26_R2_cover_letter.docx
+++ b/b2/paper/responses/2026-05-26_R2_cover_letter.docx
@@ -2,7 +2,7 @@
 <file path=word/document.xml><?xml version="1.0" encoding="utf-8"?>
 <w:document xmlns:w="http://schemas.openxmlformats.org/wordprocessingml/2006/main" xmlns:m="http://schemas.openxmlformats.org/officeDocument/2006/math" xmlns:r="http://schemas.openxmlformats.org/officeDocument/2006/relationships" xmlns:o="urn:schemas-microsoft-com:office:office" xmlns:v="urn:schemas-microsoft-com:vml" xmlns:w10="urn:schemas-microsoft-com:office:word" xmlns:a="http://schemas.openxmlformats.org/drawingml/2006/main" xmlns:pic="http://schemas.openxmlformats.org/drawingml/2006/picture" xmlns:wp="http://schemas.openxmlformats.org/drawingml/2006/wordprocessingDrawing">
   <w:body>
-    <w:bookmarkStart w:id="14" w:name="cover-letter-b2-r2-submission"/>
+    <w:bookmarkStart w:id="15" w:name="cover-letter-b2-r2-submission"/>
     <w:p>
       <w:pPr>
         <w:pStyle w:val="Heading1"/>
@@ -299,11 +299,29 @@
         <w:t xml:space="preserve"> </w:t>
       </w:r>
       <w:r>
-        <w:t xml:space="preserve">(Section 4.5) - Voting-HHI exceeds post-exclusion holding HHI in thirteen of eighteen protocols with sufficient governance data (range 1.6x DRIFT to 25.6x Polkadot; mean approximately 6.8x, median 4.4x). Five protocols disperse voting power below the holding baseline (ENS at 0.45x; GMX at 0.87x; HNT at 0.35x to 0.53x; JUP at 0.057x, the most-extreme dispersion outlier in the cross-section; and LPT at 0.27x, the most pronounced DePIN governance disperser, with Livepeer holding concentration unchanged at the cross-section maximum). Curve veCRV, Balancer veBAL, and Frax veFXS form a separate vote-escrowed class with extreme amplification (15x, 21x, and 11.4x respectively).</w:t>
+        <w:t xml:space="preserve">(Section 4.5) - Voting-HHI exceeds post-exclusion holding HHI in thirteen of eighteen protocols with sufficient governance data (range 1.6x DRIFT to 25.6x Polkadot; mean approximately 6.8x, median 4.4x). Five protocols disperse voting power below the holding baseline (ENS at 0.45x; GMX at 0.87x; HNT at 0.35x to 0.53x; JUP at 0.043x, the most-extreme dispersion outlier in the cross-section; and LPT at 0.27x, the most pronounced DePIN governance disperser, with Livepeer holding concentration unchanged at the cross-section maximum). Curve veCRV, Balancer veBAL, and Frax veFXS form a separate vote-escrowed class with extreme amplification (15x, 21x, and 11.4x respectively).</w:t>
       </w:r>
     </w:p>
     <w:bookmarkEnd w:id="9"/>
-    <w:bookmarkStart w:id="10" w:name="submission-package-contents"/>
+    <w:bookmarkStart w:id="10" w:name="reference-additions-since-r1"/>
+    <w:p>
+      <w:pPr>
+        <w:pStyle w:val="Heading2"/>
+      </w:pPr>
+      <w:r>
+        <w:t xml:space="preserve">Reference additions since R1</w:t>
+      </w:r>
+    </w:p>
+    <w:p>
+      <w:pPr>
+        <w:pStyle w:val="FirstParagraph"/>
+      </w:pPr>
+      <w:r>
+        <w:t xml:space="preserve">The revision adds a small set of references that situate the measurement contribution within two established literatures it had previously drawn on only implicitly: the de jure versus de facto power distinction in comparative political economy, and the separation of ownership from control in corporate governance. These additions name the lineage behind framings the R1 manuscript already used but left uncited (for example, the description of outcomes as formally decentralized but substantively centralized), and they reinforce the audit-practice argument without altering any statistical finding. They are positioning citations for an empirical measurement paper, not a turn toward corporate-finance theory.</w:t>
+      </w:r>
+    </w:p>
+    <w:bookmarkEnd w:id="10"/>
+    <w:bookmarkStart w:id="11" w:name="submission-package-contents"/>
     <w:p>
       <w:pPr>
         <w:pStyle w:val="Heading2"/>
@@ -405,8 +423,8 @@
         <w:t xml:space="preserve">The address-by-address PCA exclusion log and the full regression dataset are available at the linked GitHub replication repository.</w:t>
       </w:r>
     </w:p>
-    <w:bookmarkEnd w:id="10"/>
-    <w:bookmarkStart w:id="11" w:name="methodology-disclosure"/>
+    <w:bookmarkEnd w:id="11"/>
+    <w:bookmarkStart w:id="12" w:name="methodology-disclosure"/>
     <w:p>
       <w:pPr>
         <w:pStyle w:val="Heading2"/>
@@ -420,11 +438,11 @@
         <w:pStyle w:val="FirstParagraph"/>
       </w:pPr>
       <w:r>
-        <w:t xml:space="preserve">The revision reconciles all reported statistics against a single source-of-truth regression dataset to prevent recurrence of the manuscript-vs-data drift Reviewer 1 surfaced in the R1 review. A statistics ledger (Supplementary File S0) lists every body-text statistic with its sample size and the reporting convention; the ledger is the single source of truth that body, tables, figures, captions, abstract, and conclusion reconcile against, and all reported statistics are reconciled against it. Snapshot-date discipline is acknowledged: Table 7 voting-HHI values for the eight protocols sampled at the R1 scope use a March 2026 snapshot consistent with the rest of the dataset; the GMX and ENS additions use a May 2026 Tally snapshot (documented in Section 4.5 Table 7 footnote as a deliberate methodological exception for the added protocols). The May 2026 Tally and Snapshot replication confirms delegate-pool drift; rank ordering across protocols is the more durable inferential property than absolute magnitude.</w:t>
-      </w:r>
-    </w:p>
-    <w:bookmarkEnd w:id="11"/>
-    <w:bookmarkStart w:id="12" w:name="conflict-of-interest"/>
+        <w:t xml:space="preserve">The revision reconciles all reported statistics against a single source-of-truth regression dataset to prevent recurrence of the manuscript-vs-data drift Reviewer 1 surfaced in the R1 review. A statistics ledger (Supplementary File S0) lists every body-text statistic with its sample size and the reporting convention; the ledger is the single source of truth that body, tables, figures, captions, abstract, and conclusion reconcile against, and all reported statistics are reconciled against it. Snapshot-date discipline is acknowledged: Table 6 voting-HHI values use a March 2026 snapshot where available, consistent with the holder-list snapshot; the GMX and ENS additions use a May 2026 Tally snapshot, documented in the Table 6 footnote as a deliberate methodological exception for added protocols. The May 2026 Tally and Snapshot replication confirms delegate-pool drift; rank ordering across protocols is the more durable inferential property than absolute magnitude.</w:t>
+      </w:r>
+    </w:p>
+    <w:bookmarkEnd w:id="12"/>
+    <w:bookmarkStart w:id="13" w:name="conflict-of-interest"/>
     <w:p>
       <w:pPr>
         <w:pStyle w:val="Heading2"/>
@@ -441,8 +459,8 @@
         <w:t xml:space="preserve">The author served as Senior Investment Analyst at Borderless Capital, a cryptocurrency-focused investment firm, through February 2026 and retains no decision-making role, carried interest, or position-dependent compensation with the firm. The author may hold small personal positions in some of the protocols analyzed; positions were established outside the research period and are not position-dependent on Borderless Capital. A complete disclosure is provided in the Conflict of Interest statement accompanying this submission. No co-authors or other conflicts of interest.</w:t>
       </w:r>
     </w:p>
-    <w:bookmarkEnd w:id="12"/>
-    <w:bookmarkStart w:id="13" w:name="acknowledgment"/>
+    <w:bookmarkEnd w:id="13"/>
+    <w:bookmarkStart w:id="14" w:name="acknowledgment"/>
     <w:p>
       <w:pPr>
         <w:pStyle w:val="Heading2"/>
@@ -515,8 +533,8 @@
         <w:t xml:space="preserve">ORCID: 0009-0006-3642-2450</w:t>
       </w:r>
     </w:p>
-    <w:bookmarkEnd w:id="13"/>
     <w:bookmarkEnd w:id="14"/>
+    <w:bookmarkEnd w:id="15"/>
     <w:sectPr>
       <w:footnotePr>
         <w:numRestart w:val="eachSect"/>

</xml_diff>